<commit_message>
Correct Qualifier Sourcing fee discount to 10% ($5,400); totals wire $10,270.00 / card $10,670.53
</commit_message>
<xml_diff>
--- a/attached_assets/handoff/Rose to Carmen Handoff Update v2.docx
+++ b/attached_assets/handoff/Rose to Carmen Handoff Update v2.docx
@@ -142,7 +142,7 @@
         </w:numPr>
       </w:pPr>
       <w:r>
-        <w:t xml:space="preserve">artifacts/obrien-proposal/src/components/sections/Investment.tsx — Rose-approved pricing update: Nevada State Application Fee $250 struck through, '100% discount applied', now $0; Qualifier Sourcing and Coordination Fee $6,000 struck through, '$10 discount applied', now $5,990; Wire Payment Total $11,120.00 → $10,860.00; Card Payment Total $11,553.68 → $11,283.54 (10,860 × 1.039, 3.9% card fee note unchanged).</w:t>
+        <w:t xml:space="preserve">artifacts/obrien-proposal/src/components/sections/Investment.tsx — Rose-approved pricing update: Nevada State Application Fee $250 struck through, '100% discount applied', now $0; Qualifier Sourcing and Coordination Fee $6,000 struck through, '10% discount applied', now $5,400; Wire Payment Total $11,120.00 → $10,270.00; Card Payment Total $11,553.68 → $10,670.53 (10,270 × 1.039, 3.9% card fee note unchanged).</w:t>
       </w:r>
     </w:p>
     <w:p>
@@ -210,7 +210,7 @@
         </w:numPr>
       </w:pPr>
       <w:r>
-        <w:t xml:space="preserve">NEW authoritative figures: wire $10,860.00; card $11,283.54; 3.9% card fee note; discount lines as above. The old $11,120.00 / $11,553.68 figures are superseded — do not restore them from v1.</w:t>
+        <w:t xml:space="preserve">NEW authoritative figures: wire $10,270.00; card $10,670.53; 3.9% card fee note; discount lines as above. The old $11,120.00 / $11,553.68 figures are superseded — do not restore them from v1.</w:t>
       </w:r>
     </w:p>
     <w:p>

</xml_diff>